<commit_message>
Adiciona linha que faltava (dia 31) na tabela de comissionados e reduz altura das linhas de dia
Co-Authored-By: Claude Fable 5 <noreply@anthropic.com>
</commit_message>
<xml_diff>
--- a/backend/FREQUÊNCIA_MENSAL.docx
+++ b/backend/FREQUÊNCIA_MENSAL.docx
@@ -1024,6 +1024,160 @@
               </w:rPr>
               <w:t>ASSINATURA</w:t>
             </w:r>
+          </w:p>
+        </w:tc>
+      </w:tr>
+      <w:tr>
+        <w:trPr>
+          <w:trHeight w:val="301"/>
+        </w:trPr>
+        <w:tc>
+          <w:tcPr>
+            <w:tcW w:w="446" w:type="dxa"/>
+            <w:vAlign w:val="center"/>
+          </w:tcPr>
+          <w:p>
+            <w:pPr>
+              <w:jc w:val="center"/>
+              <w:rPr>
+                <w:rFonts w:ascii="Open Sans" w:hAnsi="Open Sans" w:cs="Open Sans"/>
+                <w:sz w:val="14"/>
+                <w:szCs w:val="14"/>
+              </w:rPr>
+            </w:pPr>
+          </w:p>
+        </w:tc>
+        <w:tc>
+          <w:tcPr>
+            <w:tcW w:w="914" w:type="dxa"/>
+            <w:vAlign w:val="center"/>
+          </w:tcPr>
+          <w:p>
+            <w:pPr>
+              <w:jc w:val="center"/>
+              <w:rPr>
+                <w:rFonts w:ascii="Open Sans" w:hAnsi="Open Sans" w:cs="Open Sans"/>
+                <w:sz w:val="14"/>
+                <w:szCs w:val="14"/>
+              </w:rPr>
+            </w:pPr>
+          </w:p>
+        </w:tc>
+        <w:tc>
+          <w:tcPr>
+            <w:tcW w:w="1763" w:type="dxa"/>
+            <w:gridSpan w:val="2"/>
+            <w:vAlign w:val="center"/>
+          </w:tcPr>
+          <w:p>
+            <w:pPr>
+              <w:jc w:val="center"/>
+              <w:rPr>
+                <w:rFonts w:ascii="Open Sans" w:hAnsi="Open Sans" w:cs="Open Sans"/>
+                <w:sz w:val="14"/>
+                <w:szCs w:val="14"/>
+              </w:rPr>
+            </w:pPr>
+          </w:p>
+        </w:tc>
+        <w:tc>
+          <w:tcPr>
+            <w:tcW w:w="984" w:type="dxa"/>
+            <w:gridSpan w:val="2"/>
+            <w:vAlign w:val="center"/>
+          </w:tcPr>
+          <w:p>
+            <w:pPr>
+              <w:jc w:val="center"/>
+              <w:rPr>
+                <w:rFonts w:ascii="Open Sans" w:hAnsi="Open Sans" w:cs="Open Sans"/>
+                <w:sz w:val="14"/>
+                <w:szCs w:val="14"/>
+              </w:rPr>
+            </w:pPr>
+          </w:p>
+        </w:tc>
+        <w:tc>
+          <w:tcPr>
+            <w:tcW w:w="1682" w:type="dxa"/>
+            <w:vAlign w:val="center"/>
+          </w:tcPr>
+          <w:p>
+            <w:pPr>
+              <w:jc w:val="center"/>
+              <w:rPr>
+                <w:rFonts w:ascii="Open Sans" w:hAnsi="Open Sans" w:cs="Open Sans"/>
+                <w:sz w:val="14"/>
+                <w:szCs w:val="14"/>
+              </w:rPr>
+            </w:pPr>
+          </w:p>
+        </w:tc>
+        <w:tc>
+          <w:tcPr>
+            <w:tcW w:w="994" w:type="dxa"/>
+            <w:vAlign w:val="center"/>
+          </w:tcPr>
+          <w:p>
+            <w:pPr>
+              <w:jc w:val="center"/>
+              <w:rPr>
+                <w:rFonts w:ascii="Open Sans" w:hAnsi="Open Sans" w:cs="Open Sans"/>
+                <w:sz w:val="14"/>
+                <w:szCs w:val="14"/>
+              </w:rPr>
+            </w:pPr>
+          </w:p>
+        </w:tc>
+        <w:tc>
+          <w:tcPr>
+            <w:tcW w:w="1550" w:type="dxa"/>
+            <w:gridSpan w:val="2"/>
+            <w:vAlign w:val="center"/>
+          </w:tcPr>
+          <w:p>
+            <w:pPr>
+              <w:jc w:val="center"/>
+              <w:rPr>
+                <w:rFonts w:ascii="Open Sans" w:hAnsi="Open Sans" w:cs="Open Sans"/>
+                <w:sz w:val="14"/>
+                <w:szCs w:val="14"/>
+              </w:rPr>
+            </w:pPr>
+          </w:p>
+        </w:tc>
+        <w:tc>
+          <w:tcPr>
+            <w:tcW w:w="988" w:type="dxa"/>
+            <w:gridSpan w:val="2"/>
+            <w:vAlign w:val="center"/>
+          </w:tcPr>
+          <w:p>
+            <w:pPr>
+              <w:jc w:val="center"/>
+              <w:rPr>
+                <w:rFonts w:ascii="Open Sans" w:hAnsi="Open Sans" w:cs="Open Sans"/>
+                <w:sz w:val="14"/>
+                <w:szCs w:val="14"/>
+              </w:rPr>
+            </w:pPr>
+          </w:p>
+        </w:tc>
+        <w:tc>
+          <w:tcPr>
+            <w:tcW w:w="1409" w:type="dxa"/>
+            <w:gridSpan w:val="2"/>
+            <w:vAlign w:val="center"/>
+          </w:tcPr>
+          <w:p>
+            <w:pPr>
+              <w:jc w:val="center"/>
+              <w:rPr>
+                <w:rFonts w:ascii="Open Sans" w:hAnsi="Open Sans" w:cs="Open Sans"/>
+                <w:sz w:val="14"/>
+                <w:szCs w:val="14"/>
+              </w:rPr>
+            </w:pPr>
           </w:p>
         </w:tc>
       </w:tr>

</xml_diff>